<commit_message>
feat: Add LayerManager for managing DXF layer visibility
- Implemented LayerManager class to display and toggle visibility of DXF layers.
- Integrated LayerManager into the main application with a dock widget.
- Enhanced DxfImportWorker to extract layer information from DXF entities.
- Updated UI to include status bar for cursor coordinates and mode.
- Added precision settings for metric display in ScaleManager.
- Improved node and pipe rendering to be scale-aware.
- Introduced undo/redo functionality in the edit menu.
</commit_message>
<xml_diff>
--- a/GENERAL.docx
+++ b/GENERAL.docx
@@ -3,6 +3,73 @@
 <w:document xmlns:wpc="http://schemas.microsoft.com/office/word/2010/wordprocessingCanvas" xmlns:cx="http://schemas.microsoft.com/office/drawing/2014/chartex" xmlns:cx1="http://schemas.microsoft.com/office/drawing/2015/9/8/chartex" xmlns:cx2="http://schemas.microsoft.com/office/drawing/2015/10/21/chartex" xmlns:cx3="http://schemas.microsoft.com/office/drawing/2016/5/9/chartex" xmlns:cx4="http://schemas.microsoft.com/office/drawing/2016/5/10/chartex" xmlns:cx5="http://schemas.microsoft.com/office/drawing/2016/5/11/chartex" xmlns:cx6="http://schemas.microsoft.com/office/drawing/2016/5/12/chartex" xmlns:cx7="http://schemas.microsoft.com/office/drawing/2016/5/13/chartex" xmlns:cx8="http://schemas.microsoft.com/office/drawing/2016/5/14/chartex" xmlns:mc="http://schemas.openxmlformats.org/markup-compatibility/2006" xmlns:aink="http://schemas.microsoft.com/office/drawing/2016/ink" xmlns:am3d="http://schemas.microsoft.com/office/drawing/2017/model3d" xmlns:o="urn:schemas-microsoft-com:office:office" xmlns:oel="http://schemas.microsoft.com/office/2019/extlst" xmlns:r="http://schemas.openxmlformats.org/officeDocument/2006/relationships" xmlns:m="http://schemas.openxmlformats.org/officeDocument/2006/math" xmlns:v="urn:schemas-microsoft-com:vml" xmlns:wp14="http://schemas.microsoft.com/office/word/2010/wordprocessingDrawing" xmlns:wp="http://schemas.openxmlformats.org/drawingml/2006/wordprocessingDrawing" xmlns:w10="urn:schemas-microsoft-com:office:word" xmlns:w="http://schemas.openxmlformats.org/wordprocessingml/2006/main" xmlns:w14="http://schemas.microsoft.com/office/word/2010/wordml" xmlns:w15="http://schemas.microsoft.com/office/word/2012/wordml" xmlns:w16cex="http://schemas.microsoft.com/office/word/2018/wordml/cex" xmlns:w16cid="http://schemas.microsoft.com/office/word/2016/wordml/cid" xmlns:w16="http://schemas.microsoft.com/office/word/2018/wordml" xmlns:w16du="http://schemas.microsoft.com/office/word/2023/wordml/word16du" xmlns:w16sdtdh="http://schemas.microsoft.com/office/word/2020/wordml/sdtdatahash" xmlns:w16sdtfl="http://schemas.microsoft.com/office/word/2024/wordml/sdtformatlock" xmlns:w16se="http://schemas.microsoft.com/office/word/2015/wordml/symex" xmlns:wpg="http://schemas.microsoft.com/office/word/2010/wordprocessingGroup" xmlns:wpi="http://schemas.microsoft.com/office/word/2010/wordprocessingInk" xmlns:wne="http://schemas.microsoft.com/office/word/2006/wordml" xmlns:wps="http://schemas.microsoft.com/office/word/2010/wordprocessingShape" mc:Ignorable="w14 w15 w16se w16cid w16 w16cex w16sdtdh w16sdtfl w16du wp14">
   <w:body>
     <w:p>
+      <w:proofErr w:type="spellStart"/>
+      <w:r>
+        <w:t>Promtps</w:t>
+      </w:r>
+      <w:proofErr w:type="spellEnd"/>
+      <w:r>
+        <w:t>:</w:t>
+      </w:r>
+    </w:p>
+    <w:p>
+      <w:r>
+        <w:t>Importing</w:t>
+      </w:r>
+    </w:p>
+    <w:p>
+      <w:proofErr w:type="spellStart"/>
+      <w:r>
+        <w:t>Scalign</w:t>
+      </w:r>
+      <w:proofErr w:type="spellEnd"/>
+    </w:p>
+    <w:p>
+      <w:pPr>
+        <w:pStyle w:val="ListParagraph"/>
+        <w:numPr>
+          <w:ilvl w:val="0"/>
+          <w:numId w:val="6"/>
+        </w:numPr>
+      </w:pPr>
+      <w:r>
+        <w:t xml:space="preserve">I want the base scale of the model space to be 1:1. In other words I want a realistic </w:t>
+      </w:r>
+      <w:r>
+        <w:t xml:space="preserve">display of whatever is being modelled. </w:t>
+      </w:r>
+      <w:proofErr w:type="gramStart"/>
+      <w:r>
+        <w:t>So</w:t>
+      </w:r>
+      <w:proofErr w:type="gramEnd"/>
+      <w:r>
+        <w:t xml:space="preserve"> if I have an </w:t>
+      </w:r>
+      <w:proofErr w:type="spellStart"/>
+      <w:r>
+        <w:t>an</w:t>
+      </w:r>
+      <w:proofErr w:type="spellEnd"/>
+      <w:r>
+        <w:t xml:space="preserve"> 11x17 </w:t>
+      </w:r>
+      <w:r>
+        <w:t>documents. I want the modelled lines to show up as they would print. I think this means we would need a second scale to determine the value of dimensions.</w:t>
+      </w:r>
+    </w:p>
+    <w:p>
+      <w:pPr>
+        <w:pStyle w:val="ListParagraph"/>
+        <w:numPr>
+          <w:ilvl w:val="0"/>
+          <w:numId w:val="6"/>
+        </w:numPr>
+      </w:pPr>
+    </w:p>
+    <w:p/>
+    <w:p/>
+    <w:p>
       <w:r>
         <w:t>GENERAL</w:t>
       </w:r>
@@ -384,6 +451,7 @@
         </w:numPr>
       </w:pPr>
       <w:r>
+        <w:lastRenderedPageBreak/>
         <w:t>Dimensioning</w:t>
       </w:r>
     </w:p>
@@ -428,7 +496,695 @@
         <w:ind w:firstLine="720"/>
       </w:pPr>
     </w:p>
+    <w:p>
+      <w:r>
+        <w:t>Line Weights</w:t>
+      </w:r>
+    </w:p>
+    <w:p>
+      <w:pPr>
+        <w:numPr>
+          <w:ilvl w:val="0"/>
+          <w:numId w:val="7"/>
+        </w:numPr>
+        <w:rPr>
+          <w:lang w:val="en-US"/>
+        </w:rPr>
+      </w:pPr>
+      <w:r>
+        <w:rPr>
+          <w:lang w:val="en-US"/>
+        </w:rPr>
+        <w:t xml:space="preserve">0.7mm – </w:t>
+      </w:r>
+      <w:r>
+        <w:rPr>
+          <w:lang w:val="en-US"/>
+        </w:rPr>
+        <w:t>Very Heavy</w:t>
+      </w:r>
+    </w:p>
+    <w:p>
+      <w:pPr>
+        <w:numPr>
+          <w:ilvl w:val="0"/>
+          <w:numId w:val="7"/>
+        </w:numPr>
+        <w:rPr>
+          <w:lang w:val="en-US"/>
+        </w:rPr>
+      </w:pPr>
+      <w:r>
+        <w:rPr>
+          <w:lang w:val="en-US"/>
+        </w:rPr>
+        <w:t xml:space="preserve">0.5mm – </w:t>
+      </w:r>
+      <w:r>
+        <w:rPr>
+          <w:lang w:val="en-US"/>
+        </w:rPr>
+        <w:t>Light</w:t>
+      </w:r>
+      <w:r>
+        <w:rPr>
+          <w:lang w:val="en-US"/>
+        </w:rPr>
+        <w:tab/>
+      </w:r>
+    </w:p>
+    <w:p>
+      <w:pPr>
+        <w:numPr>
+          <w:ilvl w:val="0"/>
+          <w:numId w:val="7"/>
+        </w:numPr>
+        <w:rPr>
+          <w:lang w:val="en-US"/>
+        </w:rPr>
+      </w:pPr>
+      <w:r>
+        <w:rPr>
+          <w:lang w:val="en-US"/>
+        </w:rPr>
+        <w:t xml:space="preserve">0.35mm – </w:t>
+      </w:r>
+      <w:r>
+        <w:rPr>
+          <w:lang w:val="en-US"/>
+        </w:rPr>
+        <w:t>Medium</w:t>
+      </w:r>
+    </w:p>
+    <w:p>
+      <w:pPr>
+        <w:numPr>
+          <w:ilvl w:val="0"/>
+          <w:numId w:val="7"/>
+        </w:numPr>
+        <w:rPr>
+          <w:lang w:val="en-US"/>
+        </w:rPr>
+      </w:pPr>
+      <w:r>
+        <w:rPr>
+          <w:lang w:val="en-US"/>
+        </w:rPr>
+        <w:t xml:space="preserve">0.25mm – </w:t>
+      </w:r>
+      <w:r>
+        <w:rPr>
+          <w:lang w:val="en-US"/>
+        </w:rPr>
+        <w:t>Light</w:t>
+      </w:r>
+    </w:p>
+    <w:p>
+      <w:pPr>
+        <w:numPr>
+          <w:ilvl w:val="0"/>
+          <w:numId w:val="7"/>
+        </w:numPr>
+        <w:rPr>
+          <w:lang w:val="en-US"/>
+        </w:rPr>
+      </w:pPr>
+      <w:r>
+        <w:rPr>
+          <w:lang w:val="en-US"/>
+        </w:rPr>
+        <w:t xml:space="preserve">0.18mm – </w:t>
+      </w:r>
+      <w:r>
+        <w:rPr>
+          <w:lang w:val="en-US"/>
+        </w:rPr>
+        <w:t>Very Light</w:t>
+      </w:r>
+    </w:p>
     <w:p/>
+    <w:p>
+      <w:r>
+        <w:rPr>
+          <w:noProof/>
+        </w:rPr>
+        <w:drawing>
+          <wp:inline distT="0" distB="0" distL="0" distR="0" wp14:anchorId="63301B55" wp14:editId="3BA17434">
+            <wp:extent cx="5943600" cy="1344295"/>
+            <wp:effectExtent l="0" t="0" r="0" b="8255"/>
+            <wp:docPr id="2143076705" name="Picture 1"/>
+            <wp:cNvGraphicFramePr>
+              <a:graphicFrameLocks xmlns:a="http://schemas.openxmlformats.org/drawingml/2006/main" noChangeAspect="1"/>
+            </wp:cNvGraphicFramePr>
+            <a:graphic xmlns:a="http://schemas.openxmlformats.org/drawingml/2006/main">
+              <a:graphicData uri="http://schemas.openxmlformats.org/drawingml/2006/picture">
+                <pic:pic xmlns:pic="http://schemas.openxmlformats.org/drawingml/2006/picture">
+                  <pic:nvPicPr>
+                    <pic:cNvPr id="2143076705" name=""/>
+                    <pic:cNvPicPr/>
+                  </pic:nvPicPr>
+                  <pic:blipFill>
+                    <a:blip r:embed="rId8"/>
+                    <a:stretch>
+                      <a:fillRect/>
+                    </a:stretch>
+                  </pic:blipFill>
+                  <pic:spPr>
+                    <a:xfrm>
+                      <a:off x="0" y="0"/>
+                      <a:ext cx="5943600" cy="1344295"/>
+                    </a:xfrm>
+                    <a:prstGeom prst="rect">
+                      <a:avLst/>
+                    </a:prstGeom>
+                  </pic:spPr>
+                </pic:pic>
+              </a:graphicData>
+            </a:graphic>
+          </wp:inline>
+        </w:drawing>
+      </w:r>
+    </w:p>
+    <w:p>
+      <w:r>
+        <w:rPr>
+          <w:noProof/>
+        </w:rPr>
+        <w:drawing>
+          <wp:inline distT="0" distB="0" distL="0" distR="0" wp14:anchorId="46187C93" wp14:editId="15D763BB">
+            <wp:extent cx="5943600" cy="1940560"/>
+            <wp:effectExtent l="0" t="0" r="0" b="2540"/>
+            <wp:docPr id="812161370" name="Picture 1"/>
+            <wp:cNvGraphicFramePr>
+              <a:graphicFrameLocks xmlns:a="http://schemas.openxmlformats.org/drawingml/2006/main" noChangeAspect="1"/>
+            </wp:cNvGraphicFramePr>
+            <a:graphic xmlns:a="http://schemas.openxmlformats.org/drawingml/2006/main">
+              <a:graphicData uri="http://schemas.openxmlformats.org/drawingml/2006/picture">
+                <pic:pic xmlns:pic="http://schemas.openxmlformats.org/drawingml/2006/picture">
+                  <pic:nvPicPr>
+                    <pic:cNvPr id="812161370" name=""/>
+                    <pic:cNvPicPr/>
+                  </pic:nvPicPr>
+                  <pic:blipFill>
+                    <a:blip r:embed="rId9"/>
+                    <a:stretch>
+                      <a:fillRect/>
+                    </a:stretch>
+                  </pic:blipFill>
+                  <pic:spPr>
+                    <a:xfrm>
+                      <a:off x="0" y="0"/>
+                      <a:ext cx="5943600" cy="1940560"/>
+                    </a:xfrm>
+                    <a:prstGeom prst="rect">
+                      <a:avLst/>
+                    </a:prstGeom>
+                  </pic:spPr>
+                </pic:pic>
+              </a:graphicData>
+            </a:graphic>
+          </wp:inline>
+        </w:drawing>
+      </w:r>
+    </w:p>
+    <w:p>
+      <w:r>
+        <w:rPr>
+          <w:noProof/>
+        </w:rPr>
+        <w:drawing>
+          <wp:inline distT="0" distB="0" distL="0" distR="0" wp14:anchorId="0264B1D6" wp14:editId="6C070C25">
+            <wp:extent cx="4457143" cy="1514286"/>
+            <wp:effectExtent l="0" t="0" r="635" b="0"/>
+            <wp:docPr id="1188865450" name="Picture 1"/>
+            <wp:cNvGraphicFramePr>
+              <a:graphicFrameLocks xmlns:a="http://schemas.openxmlformats.org/drawingml/2006/main" noChangeAspect="1"/>
+            </wp:cNvGraphicFramePr>
+            <a:graphic xmlns:a="http://schemas.openxmlformats.org/drawingml/2006/main">
+              <a:graphicData uri="http://schemas.openxmlformats.org/drawingml/2006/picture">
+                <pic:pic xmlns:pic="http://schemas.openxmlformats.org/drawingml/2006/picture">
+                  <pic:nvPicPr>
+                    <pic:cNvPr id="1188865450" name=""/>
+                    <pic:cNvPicPr/>
+                  </pic:nvPicPr>
+                  <pic:blipFill>
+                    <a:blip r:embed="rId10"/>
+                    <a:stretch>
+                      <a:fillRect/>
+                    </a:stretch>
+                  </pic:blipFill>
+                  <pic:spPr>
+                    <a:xfrm>
+                      <a:off x="0" y="0"/>
+                      <a:ext cx="4457143" cy="1514286"/>
+                    </a:xfrm>
+                    <a:prstGeom prst="rect">
+                      <a:avLst/>
+                    </a:prstGeom>
+                  </pic:spPr>
+                </pic:pic>
+              </a:graphicData>
+            </a:graphic>
+          </wp:inline>
+        </w:drawing>
+      </w:r>
+    </w:p>
+    <w:p>
+      <w:r>
+        <w:rPr>
+          <w:noProof/>
+        </w:rPr>
+        <w:lastRenderedPageBreak/>
+        <w:drawing>
+          <wp:inline distT="0" distB="0" distL="0" distR="0" wp14:anchorId="29A6429D" wp14:editId="6A5637BB">
+            <wp:extent cx="4514286" cy="3980952"/>
+            <wp:effectExtent l="0" t="0" r="635" b="635"/>
+            <wp:docPr id="741307053" name="Picture 1"/>
+            <wp:cNvGraphicFramePr>
+              <a:graphicFrameLocks xmlns:a="http://schemas.openxmlformats.org/drawingml/2006/main" noChangeAspect="1"/>
+            </wp:cNvGraphicFramePr>
+            <a:graphic xmlns:a="http://schemas.openxmlformats.org/drawingml/2006/main">
+              <a:graphicData uri="http://schemas.openxmlformats.org/drawingml/2006/picture">
+                <pic:pic xmlns:pic="http://schemas.openxmlformats.org/drawingml/2006/picture">
+                  <pic:nvPicPr>
+                    <pic:cNvPr id="741307053" name=""/>
+                    <pic:cNvPicPr/>
+                  </pic:nvPicPr>
+                  <pic:blipFill>
+                    <a:blip r:embed="rId11"/>
+                    <a:stretch>
+                      <a:fillRect/>
+                    </a:stretch>
+                  </pic:blipFill>
+                  <pic:spPr>
+                    <a:xfrm>
+                      <a:off x="0" y="0"/>
+                      <a:ext cx="4514286" cy="3980952"/>
+                    </a:xfrm>
+                    <a:prstGeom prst="rect">
+                      <a:avLst/>
+                    </a:prstGeom>
+                  </pic:spPr>
+                </pic:pic>
+              </a:graphicData>
+            </a:graphic>
+          </wp:inline>
+        </w:drawing>
+      </w:r>
+    </w:p>
+    <w:p>
+      <w:r>
+        <w:rPr>
+          <w:noProof/>
+        </w:rPr>
+        <w:lastRenderedPageBreak/>
+        <w:drawing>
+          <wp:inline distT="0" distB="0" distL="0" distR="0" wp14:anchorId="467B3743" wp14:editId="0003E9AC">
+            <wp:extent cx="4400000" cy="7314286"/>
+            <wp:effectExtent l="0" t="0" r="635" b="1270"/>
+            <wp:docPr id="2007784637" name="Picture 1"/>
+            <wp:cNvGraphicFramePr>
+              <a:graphicFrameLocks xmlns:a="http://schemas.openxmlformats.org/drawingml/2006/main" noChangeAspect="1"/>
+            </wp:cNvGraphicFramePr>
+            <a:graphic xmlns:a="http://schemas.openxmlformats.org/drawingml/2006/main">
+              <a:graphicData uri="http://schemas.openxmlformats.org/drawingml/2006/picture">
+                <pic:pic xmlns:pic="http://schemas.openxmlformats.org/drawingml/2006/picture">
+                  <pic:nvPicPr>
+                    <pic:cNvPr id="2007784637" name=""/>
+                    <pic:cNvPicPr/>
+                  </pic:nvPicPr>
+                  <pic:blipFill>
+                    <a:blip r:embed="rId12"/>
+                    <a:stretch>
+                      <a:fillRect/>
+                    </a:stretch>
+                  </pic:blipFill>
+                  <pic:spPr>
+                    <a:xfrm>
+                      <a:off x="0" y="0"/>
+                      <a:ext cx="4400000" cy="7314286"/>
+                    </a:xfrm>
+                    <a:prstGeom prst="rect">
+                      <a:avLst/>
+                    </a:prstGeom>
+                  </pic:spPr>
+                </pic:pic>
+              </a:graphicData>
+            </a:graphic>
+          </wp:inline>
+        </w:drawing>
+      </w:r>
+    </w:p>
+    <w:p>
+      <w:r>
+        <w:rPr>
+          <w:noProof/>
+        </w:rPr>
+        <w:lastRenderedPageBreak/>
+        <w:drawing>
+          <wp:inline distT="0" distB="0" distL="0" distR="0" wp14:anchorId="6D0CFE98" wp14:editId="26900D33">
+            <wp:extent cx="4457143" cy="5095238"/>
+            <wp:effectExtent l="0" t="0" r="635" b="0"/>
+            <wp:docPr id="925843541" name="Picture 1"/>
+            <wp:cNvGraphicFramePr>
+              <a:graphicFrameLocks xmlns:a="http://schemas.openxmlformats.org/drawingml/2006/main" noChangeAspect="1"/>
+            </wp:cNvGraphicFramePr>
+            <a:graphic xmlns:a="http://schemas.openxmlformats.org/drawingml/2006/main">
+              <a:graphicData uri="http://schemas.openxmlformats.org/drawingml/2006/picture">
+                <pic:pic xmlns:pic="http://schemas.openxmlformats.org/drawingml/2006/picture">
+                  <pic:nvPicPr>
+                    <pic:cNvPr id="925843541" name=""/>
+                    <pic:cNvPicPr/>
+                  </pic:nvPicPr>
+                  <pic:blipFill>
+                    <a:blip r:embed="rId13"/>
+                    <a:stretch>
+                      <a:fillRect/>
+                    </a:stretch>
+                  </pic:blipFill>
+                  <pic:spPr>
+                    <a:xfrm>
+                      <a:off x="0" y="0"/>
+                      <a:ext cx="4457143" cy="5095238"/>
+                    </a:xfrm>
+                    <a:prstGeom prst="rect">
+                      <a:avLst/>
+                    </a:prstGeom>
+                  </pic:spPr>
+                </pic:pic>
+              </a:graphicData>
+            </a:graphic>
+          </wp:inline>
+        </w:drawing>
+      </w:r>
+    </w:p>
+    <w:p/>
+    <w:p>
+      <w:r>
+        <w:t>Session 2026-02-26</w:t>
+      </w:r>
+    </w:p>
+    <w:p>
+      <w:pPr>
+        <w:pStyle w:val="ListParagraph"/>
+        <w:numPr>
+          <w:ilvl w:val="0"/>
+          <w:numId w:val="8"/>
+        </w:numPr>
+      </w:pPr>
+      <w:r>
+        <w:t xml:space="preserve">Add </w:t>
+      </w:r>
+      <w:r>
+        <w:t xml:space="preserve">layer management, I would like a window to manage my underlays, it should read out the </w:t>
+      </w:r>
+      <w:r>
+        <w:t>layer available and have a check box so I can toggle their visibility</w:t>
+      </w:r>
+    </w:p>
+    <w:p>
+      <w:pPr>
+        <w:pStyle w:val="ListParagraph"/>
+        <w:numPr>
+          <w:ilvl w:val="0"/>
+          <w:numId w:val="8"/>
+        </w:numPr>
+      </w:pPr>
+      <w:r>
+        <w:t xml:space="preserve">I would like to be able to snap to the underlay </w:t>
+      </w:r>
+      <w:r>
+        <w:t xml:space="preserve">when placing pipe, sprinklers, nodes, </w:t>
+      </w:r>
+      <w:proofErr w:type="gramStart"/>
+      <w:r>
+        <w:t>etc..</w:t>
+      </w:r>
+      <w:proofErr w:type="gramEnd"/>
+      <w:r>
+        <w:t xml:space="preserve"> especially important for setting scale, </w:t>
+      </w:r>
+      <w:r>
+        <w:t xml:space="preserve">because right not I can’t select to known point on the underlay to set the scale. </w:t>
+      </w:r>
+    </w:p>
+    <w:p>
+      <w:pPr>
+        <w:pStyle w:val="ListParagraph"/>
+        <w:numPr>
+          <w:ilvl w:val="0"/>
+          <w:numId w:val="8"/>
+        </w:numPr>
+      </w:pPr>
+      <w:r>
+        <w:t>Annotation such as pipe label should scale with line weight or drawing size.</w:t>
+      </w:r>
+    </w:p>
+    <w:p>
+      <w:pPr>
+        <w:pStyle w:val="ListParagraph"/>
+        <w:numPr>
+          <w:ilvl w:val="0"/>
+          <w:numId w:val="8"/>
+        </w:numPr>
+      </w:pPr>
+      <w:r>
+        <w:t>Should be able to set the level of precision for units.</w:t>
+      </w:r>
+    </w:p>
+    <w:p>
+      <w:pPr>
+        <w:pStyle w:val="ListParagraph"/>
+        <w:numPr>
+          <w:ilvl w:val="0"/>
+          <w:numId w:val="8"/>
+        </w:numPr>
+      </w:pPr>
+      <w:r>
+        <w:t xml:space="preserve">Sprinkler graphics aren’t centered on placement. </w:t>
+      </w:r>
+    </w:p>
+    <w:p>
+      <w:pPr>
+        <w:pStyle w:val="ListParagraph"/>
+        <w:numPr>
+          <w:ilvl w:val="0"/>
+          <w:numId w:val="8"/>
+        </w:numPr>
+      </w:pPr>
+      <w:r>
+        <w:t xml:space="preserve">When nodes are </w:t>
+      </w:r>
+      <w:proofErr w:type="gramStart"/>
+      <w:r>
+        <w:t>selected</w:t>
+      </w:r>
+      <w:proofErr w:type="gramEnd"/>
+      <w:r>
+        <w:t xml:space="preserve"> they are highlighted which is good, but this isn’t scaled, so when is select a pipe </w:t>
+      </w:r>
+      <w:r>
+        <w:t xml:space="preserve">I get two huge </w:t>
+      </w:r>
+      <w:proofErr w:type="spellStart"/>
+      <w:r>
+        <w:t>highleted</w:t>
+      </w:r>
+      <w:proofErr w:type="spellEnd"/>
+      <w:r>
+        <w:t xml:space="preserve"> areas on each end. </w:t>
+      </w:r>
+    </w:p>
+    <w:p/>
+    <w:p>
+      <w:pPr>
+        <w:pStyle w:val="ListParagraph"/>
+        <w:numPr>
+          <w:ilvl w:val="0"/>
+          <w:numId w:val="8"/>
+        </w:numPr>
+      </w:pPr>
+      <w:r>
+        <w:t>Pipe labels</w:t>
+      </w:r>
+      <w:r>
+        <w:t xml:space="preserve"> </w:t>
+      </w:r>
+      <w:r>
+        <w:t xml:space="preserve">have test breaking over lines, they should all be on a single line, also when I place a line I have </w:t>
+      </w:r>
+    </w:p>
+    <w:p>
+      <w:pPr>
+        <w:pStyle w:val="ListParagraph"/>
+      </w:pPr>
+    </w:p>
+    <w:p>
+      <w:pPr>
+        <w:pStyle w:val="ListParagraph"/>
+        <w:numPr>
+          <w:ilvl w:val="0"/>
+          <w:numId w:val="9"/>
+        </w:numPr>
+      </w:pPr>
+      <w:proofErr w:type="gramStart"/>
+      <w:r>
+        <w:t>Lets</w:t>
+      </w:r>
+      <w:proofErr w:type="gramEnd"/>
+      <w:r>
+        <w:t xml:space="preserve"> organi</w:t>
+      </w:r>
+      <w:r>
+        <w:t xml:space="preserve">ze project menu with a project settings window </w:t>
+      </w:r>
+      <w:r>
+        <w:t xml:space="preserve">to select options for </w:t>
+      </w:r>
+      <w:r>
+        <w:t xml:space="preserve">scale label, label precision, </w:t>
+      </w:r>
+      <w:proofErr w:type="spellStart"/>
+      <w:proofErr w:type="gramStart"/>
+      <w:r>
+        <w:t>units,etc</w:t>
+      </w:r>
+      <w:proofErr w:type="spellEnd"/>
+      <w:r>
+        <w:t>..</w:t>
+      </w:r>
+      <w:proofErr w:type="gramEnd"/>
+      <w:r>
+        <w:t xml:space="preserve"> </w:t>
+      </w:r>
+      <w:proofErr w:type="gramStart"/>
+      <w:r>
+        <w:t>Lets</w:t>
+      </w:r>
+      <w:proofErr w:type="gramEnd"/>
+      <w:r>
+        <w:t xml:space="preserve"> also have a separate window for managing underlay whether its PDF, DXF, DWG, etc.</w:t>
+      </w:r>
+      <w:r>
+        <w:t xml:space="preserve"> including refresh underlays. </w:t>
+      </w:r>
+      <w:r>
+        <w:t>We can have another window for Project information, like project address, project name and number, etc. we won’t do anything with it yet but can use it in the future for title blocks and reporting.</w:t>
+      </w:r>
+    </w:p>
+    <w:p>
+      <w:pPr>
+        <w:pStyle w:val="ListParagraph"/>
+        <w:numPr>
+          <w:ilvl w:val="0"/>
+          <w:numId w:val="9"/>
+        </w:numPr>
+      </w:pPr>
+      <w:r>
+        <w:t>Snap work</w:t>
+      </w:r>
+      <w:r>
+        <w:t xml:space="preserve">s okay, could be improved, the overall feel of placement (sprinklers, pipe, etc.) is clunky and should be smoother, </w:t>
+      </w:r>
+      <w:r>
+        <w:t xml:space="preserve">right now the </w:t>
+      </w:r>
+      <w:proofErr w:type="spellStart"/>
+      <w:r>
+        <w:t>cursur</w:t>
+      </w:r>
+      <w:proofErr w:type="spellEnd"/>
+      <w:r>
+        <w:t xml:space="preserve"> jumps around too much. </w:t>
+      </w:r>
+    </w:p>
+    <w:p>
+      <w:pPr>
+        <w:pStyle w:val="ListParagraph"/>
+        <w:numPr>
+          <w:ilvl w:val="0"/>
+          <w:numId w:val="9"/>
+        </w:numPr>
+      </w:pPr>
+      <w:r>
+        <w:t xml:space="preserve">Size and scale of drafting data is all over the place and needs to be tighter for a professional look, </w:t>
+      </w:r>
+      <w:proofErr w:type="spellStart"/>
+      <w:r>
+        <w:t>lables</w:t>
+      </w:r>
+      <w:proofErr w:type="spellEnd"/>
+      <w:r>
+        <w:t xml:space="preserve">, fitting sizes, </w:t>
+      </w:r>
+      <w:proofErr w:type="gramStart"/>
+      <w:r>
+        <w:t>pipe line</w:t>
+      </w:r>
+      <w:proofErr w:type="gramEnd"/>
+      <w:r>
+        <w:t xml:space="preserve"> thickness, node size, sprinkler size, </w:t>
+      </w:r>
+      <w:proofErr w:type="spellStart"/>
+      <w:r>
+        <w:t>etc</w:t>
+      </w:r>
+      <w:proofErr w:type="spellEnd"/>
+      <w:r>
+        <w:t xml:space="preserve"> all needs to be improved. </w:t>
+      </w:r>
+    </w:p>
+    <w:p>
+      <w:pPr>
+        <w:pStyle w:val="ListParagraph"/>
+        <w:numPr>
+          <w:ilvl w:val="0"/>
+          <w:numId w:val="9"/>
+        </w:numPr>
+      </w:pPr>
+      <w:r>
+        <w:t xml:space="preserve">Layer manager is nice, but if I have multiple </w:t>
+      </w:r>
+      <w:proofErr w:type="gramStart"/>
+      <w:r>
+        <w:t>underlays</w:t>
+      </w:r>
+      <w:proofErr w:type="gramEnd"/>
+      <w:r>
+        <w:t xml:space="preserve"> it should group the layers under each specific file, </w:t>
+      </w:r>
+      <w:r>
+        <w:t xml:space="preserve">in a tree system. Ie. At the top we have the underlay file name (with tick box that effectively replaces </w:t>
+      </w:r>
+      <w:proofErr w:type="gramStart"/>
+      <w:r>
+        <w:t>the all</w:t>
+      </w:r>
+      <w:proofErr w:type="gramEnd"/>
+      <w:r>
+        <w:t xml:space="preserve"> on and all off toggles. </w:t>
+      </w:r>
+      <w:r>
+        <w:t xml:space="preserve">Next level down is the layer names, below that is all the line, curves, </w:t>
+      </w:r>
+      <w:proofErr w:type="spellStart"/>
+      <w:r>
+        <w:t>etc</w:t>
+      </w:r>
+      <w:proofErr w:type="spellEnd"/>
+      <w:r>
+        <w:t xml:space="preserve"> in that layer. </w:t>
+      </w:r>
+    </w:p>
+    <w:p>
+      <w:pPr>
+        <w:pStyle w:val="ListParagraph"/>
+        <w:numPr>
+          <w:ilvl w:val="0"/>
+          <w:numId w:val="9"/>
+        </w:numPr>
+      </w:pPr>
+    </w:p>
     <w:sectPr>
       <w:pgSz w:w="12240" w:h="15840" w:code="1"/>
       <w:pgMar w:top="1361" w:right="1440" w:bottom="1304" w:left="1440" w:header="709" w:footer="709" w:gutter="0"/>
@@ -442,6 +1198,95 @@
 <file path=word/numbering.xml><?xml version="1.0" encoding="utf-8"?>
 <w:numbering xmlns:wpc="http://schemas.microsoft.com/office/word/2010/wordprocessingCanvas" xmlns:cx="http://schemas.microsoft.com/office/drawing/2014/chartex" xmlns:cx1="http://schemas.microsoft.com/office/drawing/2015/9/8/chartex" xmlns:cx2="http://schemas.microsoft.com/office/drawing/2015/10/21/chartex" xmlns:cx3="http://schemas.microsoft.com/office/drawing/2016/5/9/chartex" xmlns:cx4="http://schemas.microsoft.com/office/drawing/2016/5/10/chartex" xmlns:cx5="http://schemas.microsoft.com/office/drawing/2016/5/11/chartex" xmlns:cx6="http://schemas.microsoft.com/office/drawing/2016/5/12/chartex" xmlns:cx7="http://schemas.microsoft.com/office/drawing/2016/5/13/chartex" xmlns:cx8="http://schemas.microsoft.com/office/drawing/2016/5/14/chartex" xmlns:mc="http://schemas.openxmlformats.org/markup-compatibility/2006" xmlns:aink="http://schemas.microsoft.com/office/drawing/2016/ink" xmlns:am3d="http://schemas.microsoft.com/office/drawing/2017/model3d" xmlns:o="urn:schemas-microsoft-com:office:office" xmlns:oel="http://schemas.microsoft.com/office/2019/extlst" xmlns:r="http://schemas.openxmlformats.org/officeDocument/2006/relationships" xmlns:m="http://schemas.openxmlformats.org/officeDocument/2006/math" xmlns:v="urn:schemas-microsoft-com:vml" xmlns:wp14="http://schemas.microsoft.com/office/word/2010/wordprocessingDrawing" xmlns:wp="http://schemas.openxmlformats.org/drawingml/2006/wordprocessingDrawing" xmlns:w10="urn:schemas-microsoft-com:office:word" xmlns:w="http://schemas.openxmlformats.org/wordprocessingml/2006/main" xmlns:w14="http://schemas.microsoft.com/office/word/2010/wordml" xmlns:w15="http://schemas.microsoft.com/office/word/2012/wordml" xmlns:w16cex="http://schemas.microsoft.com/office/word/2018/wordml/cex" xmlns:w16cid="http://schemas.microsoft.com/office/word/2016/wordml/cid" xmlns:w16="http://schemas.microsoft.com/office/word/2018/wordml" xmlns:w16du="http://schemas.microsoft.com/office/word/2023/wordml/word16du" xmlns:w16sdtdh="http://schemas.microsoft.com/office/word/2020/wordml/sdtdatahash" xmlns:w16sdtfl="http://schemas.microsoft.com/office/word/2024/wordml/sdtformatlock" xmlns:w16se="http://schemas.microsoft.com/office/word/2015/wordml/symex" xmlns:wpg="http://schemas.microsoft.com/office/word/2010/wordprocessingGroup" xmlns:wpi="http://schemas.microsoft.com/office/word/2010/wordprocessingInk" xmlns:wne="http://schemas.microsoft.com/office/word/2006/wordml" xmlns:wps="http://schemas.microsoft.com/office/word/2010/wordprocessingShape" mc:Ignorable="w14 w15 w16se w16cid w16 w16cex w16sdtdh w16sdtfl w16du wp14">
   <w:abstractNum w:abstractNumId="0" w15:restartNumberingAfterBreak="0">
+    <w:nsid w:val="00015312"/>
+    <w:multiLevelType w:val="hybridMultilevel"/>
+    <w:tmpl w:val="E464874C"/>
+    <w:lvl w:ilvl="0" w:tplc="0409000F">
+      <w:start w:val="1"/>
+      <w:numFmt w:val="decimal"/>
+      <w:lvlText w:val="%1."/>
+      <w:lvlJc w:val="left"/>
+      <w:pPr>
+        <w:ind w:left="720" w:hanging="360"/>
+      </w:pPr>
+      <w:rPr>
+        <w:rFonts w:hint="default"/>
+      </w:rPr>
+    </w:lvl>
+    <w:lvl w:ilvl="1" w:tplc="04090019" w:tentative="1">
+      <w:start w:val="1"/>
+      <w:numFmt w:val="lowerLetter"/>
+      <w:lvlText w:val="%2."/>
+      <w:lvlJc w:val="left"/>
+      <w:pPr>
+        <w:ind w:left="1440" w:hanging="360"/>
+      </w:pPr>
+    </w:lvl>
+    <w:lvl w:ilvl="2" w:tplc="0409001B" w:tentative="1">
+      <w:start w:val="1"/>
+      <w:numFmt w:val="lowerRoman"/>
+      <w:lvlText w:val="%3."/>
+      <w:lvlJc w:val="right"/>
+      <w:pPr>
+        <w:ind w:left="2160" w:hanging="180"/>
+      </w:pPr>
+    </w:lvl>
+    <w:lvl w:ilvl="3" w:tplc="0409000F" w:tentative="1">
+      <w:start w:val="1"/>
+      <w:numFmt w:val="decimal"/>
+      <w:lvlText w:val="%4."/>
+      <w:lvlJc w:val="left"/>
+      <w:pPr>
+        <w:ind w:left="2880" w:hanging="360"/>
+      </w:pPr>
+    </w:lvl>
+    <w:lvl w:ilvl="4" w:tplc="04090019" w:tentative="1">
+      <w:start w:val="1"/>
+      <w:numFmt w:val="lowerLetter"/>
+      <w:lvlText w:val="%5."/>
+      <w:lvlJc w:val="left"/>
+      <w:pPr>
+        <w:ind w:left="3600" w:hanging="360"/>
+      </w:pPr>
+    </w:lvl>
+    <w:lvl w:ilvl="5" w:tplc="0409001B" w:tentative="1">
+      <w:start w:val="1"/>
+      <w:numFmt w:val="lowerRoman"/>
+      <w:lvlText w:val="%6."/>
+      <w:lvlJc w:val="right"/>
+      <w:pPr>
+        <w:ind w:left="4320" w:hanging="180"/>
+      </w:pPr>
+    </w:lvl>
+    <w:lvl w:ilvl="6" w:tplc="0409000F" w:tentative="1">
+      <w:start w:val="1"/>
+      <w:numFmt w:val="decimal"/>
+      <w:lvlText w:val="%7."/>
+      <w:lvlJc w:val="left"/>
+      <w:pPr>
+        <w:ind w:left="5040" w:hanging="360"/>
+      </w:pPr>
+    </w:lvl>
+    <w:lvl w:ilvl="7" w:tplc="04090019" w:tentative="1">
+      <w:start w:val="1"/>
+      <w:numFmt w:val="lowerLetter"/>
+      <w:lvlText w:val="%8."/>
+      <w:lvlJc w:val="left"/>
+      <w:pPr>
+        <w:ind w:left="5760" w:hanging="360"/>
+      </w:pPr>
+    </w:lvl>
+    <w:lvl w:ilvl="8" w:tplc="0409001B" w:tentative="1">
+      <w:start w:val="1"/>
+      <w:numFmt w:val="lowerRoman"/>
+      <w:lvlText w:val="%9."/>
+      <w:lvlJc w:val="right"/>
+      <w:pPr>
+        <w:ind w:left="6480" w:hanging="180"/>
+      </w:pPr>
+    </w:lvl>
+  </w:abstractNum>
+  <w:abstractNum w:abstractNumId="1" w15:restartNumberingAfterBreak="0">
     <w:nsid w:val="13776EAD"/>
     <w:multiLevelType w:val="hybridMultilevel"/>
     <w:tmpl w:val="64E40C36"/>
@@ -553,7 +1398,7 @@
       </w:rPr>
     </w:lvl>
   </w:abstractNum>
-  <w:abstractNum w:abstractNumId="1" w15:restartNumberingAfterBreak="0">
+  <w:abstractNum w:abstractNumId="2" w15:restartNumberingAfterBreak="0">
     <w:nsid w:val="23B62B64"/>
     <w:multiLevelType w:val="hybridMultilevel"/>
     <w:tmpl w:val="C9241FA8"/>
@@ -666,7 +1511,7 @@
       </w:rPr>
     </w:lvl>
   </w:abstractNum>
-  <w:abstractNum w:abstractNumId="2" w15:restartNumberingAfterBreak="0">
+  <w:abstractNum w:abstractNumId="3" w15:restartNumberingAfterBreak="0">
     <w:nsid w:val="29A01EF8"/>
     <w:multiLevelType w:val="hybridMultilevel"/>
     <w:tmpl w:val="E6F292C4"/>
@@ -778,7 +1623,358 @@
       </w:rPr>
     </w:lvl>
   </w:abstractNum>
-  <w:abstractNum w:abstractNumId="3" w15:restartNumberingAfterBreak="0">
+  <w:abstractNum w:abstractNumId="4" w15:restartNumberingAfterBreak="0">
+    <w:nsid w:val="3F2E0E45"/>
+    <w:multiLevelType w:val="hybridMultilevel"/>
+    <w:tmpl w:val="B79A103E"/>
+    <w:lvl w:ilvl="0" w:tplc="0409000F">
+      <w:start w:val="1"/>
+      <w:numFmt w:val="decimal"/>
+      <w:lvlText w:val="%1."/>
+      <w:lvlJc w:val="left"/>
+      <w:pPr>
+        <w:ind w:left="720" w:hanging="360"/>
+      </w:pPr>
+      <w:rPr>
+        <w:rFonts w:hint="default"/>
+      </w:rPr>
+    </w:lvl>
+    <w:lvl w:ilvl="1" w:tplc="04090019" w:tentative="1">
+      <w:start w:val="1"/>
+      <w:numFmt w:val="lowerLetter"/>
+      <w:lvlText w:val="%2."/>
+      <w:lvlJc w:val="left"/>
+      <w:pPr>
+        <w:ind w:left="1440" w:hanging="360"/>
+      </w:pPr>
+    </w:lvl>
+    <w:lvl w:ilvl="2" w:tplc="0409001B" w:tentative="1">
+      <w:start w:val="1"/>
+      <w:numFmt w:val="lowerRoman"/>
+      <w:lvlText w:val="%3."/>
+      <w:lvlJc w:val="right"/>
+      <w:pPr>
+        <w:ind w:left="2160" w:hanging="180"/>
+      </w:pPr>
+    </w:lvl>
+    <w:lvl w:ilvl="3" w:tplc="0409000F" w:tentative="1">
+      <w:start w:val="1"/>
+      <w:numFmt w:val="decimal"/>
+      <w:lvlText w:val="%4."/>
+      <w:lvlJc w:val="left"/>
+      <w:pPr>
+        <w:ind w:left="2880" w:hanging="360"/>
+      </w:pPr>
+    </w:lvl>
+    <w:lvl w:ilvl="4" w:tplc="04090019" w:tentative="1">
+      <w:start w:val="1"/>
+      <w:numFmt w:val="lowerLetter"/>
+      <w:lvlText w:val="%5."/>
+      <w:lvlJc w:val="left"/>
+      <w:pPr>
+        <w:ind w:left="3600" w:hanging="360"/>
+      </w:pPr>
+    </w:lvl>
+    <w:lvl w:ilvl="5" w:tplc="0409001B" w:tentative="1">
+      <w:start w:val="1"/>
+      <w:numFmt w:val="lowerRoman"/>
+      <w:lvlText w:val="%6."/>
+      <w:lvlJc w:val="right"/>
+      <w:pPr>
+        <w:ind w:left="4320" w:hanging="180"/>
+      </w:pPr>
+    </w:lvl>
+    <w:lvl w:ilvl="6" w:tplc="0409000F" w:tentative="1">
+      <w:start w:val="1"/>
+      <w:numFmt w:val="decimal"/>
+      <w:lvlText w:val="%7."/>
+      <w:lvlJc w:val="left"/>
+      <w:pPr>
+        <w:ind w:left="5040" w:hanging="360"/>
+      </w:pPr>
+    </w:lvl>
+    <w:lvl w:ilvl="7" w:tplc="04090019" w:tentative="1">
+      <w:start w:val="1"/>
+      <w:numFmt w:val="lowerLetter"/>
+      <w:lvlText w:val="%8."/>
+      <w:lvlJc w:val="left"/>
+      <w:pPr>
+        <w:ind w:left="5760" w:hanging="360"/>
+      </w:pPr>
+    </w:lvl>
+    <w:lvl w:ilvl="8" w:tplc="0409001B" w:tentative="1">
+      <w:start w:val="1"/>
+      <w:numFmt w:val="lowerRoman"/>
+      <w:lvlText w:val="%9."/>
+      <w:lvlJc w:val="right"/>
+      <w:pPr>
+        <w:ind w:left="6480" w:hanging="180"/>
+      </w:pPr>
+    </w:lvl>
+  </w:abstractNum>
+  <w:abstractNum w:abstractNumId="5" w15:restartNumberingAfterBreak="0">
+    <w:nsid w:val="67F570F3"/>
+    <w:multiLevelType w:val="hybridMultilevel"/>
+    <w:tmpl w:val="266C7D1E"/>
+    <w:lvl w:ilvl="0" w:tplc="F4CE1146">
+      <w:start w:val="1045"/>
+      <w:numFmt w:val="bullet"/>
+      <w:lvlText w:val="-"/>
+      <w:lvlJc w:val="left"/>
+      <w:pPr>
+        <w:ind w:left="720" w:hanging="360"/>
+      </w:pPr>
+      <w:rPr>
+        <w:rFonts w:ascii="Aptos" w:eastAsiaTheme="minorHAnsi" w:hAnsi="Aptos" w:cstheme="minorBidi" w:hint="default"/>
+      </w:rPr>
+    </w:lvl>
+    <w:lvl w:ilvl="1" w:tplc="04090003" w:tentative="1">
+      <w:start w:val="1"/>
+      <w:numFmt w:val="bullet"/>
+      <w:lvlText w:val="o"/>
+      <w:lvlJc w:val="left"/>
+      <w:pPr>
+        <w:ind w:left="1440" w:hanging="360"/>
+      </w:pPr>
+      <w:rPr>
+        <w:rFonts w:ascii="Courier New" w:hAnsi="Courier New" w:cs="Courier New" w:hint="default"/>
+      </w:rPr>
+    </w:lvl>
+    <w:lvl w:ilvl="2" w:tplc="04090005" w:tentative="1">
+      <w:start w:val="1"/>
+      <w:numFmt w:val="bullet"/>
+      <w:lvlText w:val=""/>
+      <w:lvlJc w:val="left"/>
+      <w:pPr>
+        <w:ind w:left="2160" w:hanging="360"/>
+      </w:pPr>
+      <w:rPr>
+        <w:rFonts w:ascii="Wingdings" w:hAnsi="Wingdings" w:hint="default"/>
+      </w:rPr>
+    </w:lvl>
+    <w:lvl w:ilvl="3" w:tplc="04090001" w:tentative="1">
+      <w:start w:val="1"/>
+      <w:numFmt w:val="bullet"/>
+      <w:lvlText w:val=""/>
+      <w:lvlJc w:val="left"/>
+      <w:pPr>
+        <w:ind w:left="2880" w:hanging="360"/>
+      </w:pPr>
+      <w:rPr>
+        <w:rFonts w:ascii="Symbol" w:hAnsi="Symbol" w:hint="default"/>
+      </w:rPr>
+    </w:lvl>
+    <w:lvl w:ilvl="4" w:tplc="04090003" w:tentative="1">
+      <w:start w:val="1"/>
+      <w:numFmt w:val="bullet"/>
+      <w:lvlText w:val="o"/>
+      <w:lvlJc w:val="left"/>
+      <w:pPr>
+        <w:ind w:left="3600" w:hanging="360"/>
+      </w:pPr>
+      <w:rPr>
+        <w:rFonts w:ascii="Courier New" w:hAnsi="Courier New" w:cs="Courier New" w:hint="default"/>
+      </w:rPr>
+    </w:lvl>
+    <w:lvl w:ilvl="5" w:tplc="04090005" w:tentative="1">
+      <w:start w:val="1"/>
+      <w:numFmt w:val="bullet"/>
+      <w:lvlText w:val=""/>
+      <w:lvlJc w:val="left"/>
+      <w:pPr>
+        <w:ind w:left="4320" w:hanging="360"/>
+      </w:pPr>
+      <w:rPr>
+        <w:rFonts w:ascii="Wingdings" w:hAnsi="Wingdings" w:hint="default"/>
+      </w:rPr>
+    </w:lvl>
+    <w:lvl w:ilvl="6" w:tplc="04090001" w:tentative="1">
+      <w:start w:val="1"/>
+      <w:numFmt w:val="bullet"/>
+      <w:lvlText w:val=""/>
+      <w:lvlJc w:val="left"/>
+      <w:pPr>
+        <w:ind w:left="5040" w:hanging="360"/>
+      </w:pPr>
+      <w:rPr>
+        <w:rFonts w:ascii="Symbol" w:hAnsi="Symbol" w:hint="default"/>
+      </w:rPr>
+    </w:lvl>
+    <w:lvl w:ilvl="7" w:tplc="04090003" w:tentative="1">
+      <w:start w:val="1"/>
+      <w:numFmt w:val="bullet"/>
+      <w:lvlText w:val="o"/>
+      <w:lvlJc w:val="left"/>
+      <w:pPr>
+        <w:ind w:left="5760" w:hanging="360"/>
+      </w:pPr>
+      <w:rPr>
+        <w:rFonts w:ascii="Courier New" w:hAnsi="Courier New" w:cs="Courier New" w:hint="default"/>
+      </w:rPr>
+    </w:lvl>
+    <w:lvl w:ilvl="8" w:tplc="04090005" w:tentative="1">
+      <w:start w:val="1"/>
+      <w:numFmt w:val="bullet"/>
+      <w:lvlText w:val=""/>
+      <w:lvlJc w:val="left"/>
+      <w:pPr>
+        <w:ind w:left="6480" w:hanging="360"/>
+      </w:pPr>
+      <w:rPr>
+        <w:rFonts w:ascii="Wingdings" w:hAnsi="Wingdings" w:hint="default"/>
+      </w:rPr>
+    </w:lvl>
+  </w:abstractNum>
+  <w:abstractNum w:abstractNumId="6" w15:restartNumberingAfterBreak="0">
+    <w:nsid w:val="72767274"/>
+    <w:multiLevelType w:val="multilevel"/>
+    <w:tmpl w:val="23643584"/>
+    <w:lvl w:ilvl="0">
+      <w:start w:val="1"/>
+      <w:numFmt w:val="bullet"/>
+      <w:lvlText w:val=""/>
+      <w:lvlJc w:val="left"/>
+      <w:pPr>
+        <w:tabs>
+          <w:tab w:val="num" w:pos="720"/>
+        </w:tabs>
+        <w:ind w:left="720" w:hanging="360"/>
+      </w:pPr>
+      <w:rPr>
+        <w:rFonts w:ascii="Symbol" w:hAnsi="Symbol" w:hint="default"/>
+        <w:sz w:val="20"/>
+      </w:rPr>
+    </w:lvl>
+    <w:lvl w:ilvl="1" w:tentative="1">
+      <w:start w:val="1"/>
+      <w:numFmt w:val="bullet"/>
+      <w:lvlText w:val=""/>
+      <w:lvlJc w:val="left"/>
+      <w:pPr>
+        <w:tabs>
+          <w:tab w:val="num" w:pos="1440"/>
+        </w:tabs>
+        <w:ind w:left="1440" w:hanging="360"/>
+      </w:pPr>
+      <w:rPr>
+        <w:rFonts w:ascii="Symbol" w:hAnsi="Symbol" w:hint="default"/>
+        <w:sz w:val="20"/>
+      </w:rPr>
+    </w:lvl>
+    <w:lvl w:ilvl="2" w:tentative="1">
+      <w:start w:val="1"/>
+      <w:numFmt w:val="bullet"/>
+      <w:lvlText w:val=""/>
+      <w:lvlJc w:val="left"/>
+      <w:pPr>
+        <w:tabs>
+          <w:tab w:val="num" w:pos="2160"/>
+        </w:tabs>
+        <w:ind w:left="2160" w:hanging="360"/>
+      </w:pPr>
+      <w:rPr>
+        <w:rFonts w:ascii="Symbol" w:hAnsi="Symbol" w:hint="default"/>
+        <w:sz w:val="20"/>
+      </w:rPr>
+    </w:lvl>
+    <w:lvl w:ilvl="3" w:tentative="1">
+      <w:start w:val="1"/>
+      <w:numFmt w:val="bullet"/>
+      <w:lvlText w:val=""/>
+      <w:lvlJc w:val="left"/>
+      <w:pPr>
+        <w:tabs>
+          <w:tab w:val="num" w:pos="2880"/>
+        </w:tabs>
+        <w:ind w:left="2880" w:hanging="360"/>
+      </w:pPr>
+      <w:rPr>
+        <w:rFonts w:ascii="Symbol" w:hAnsi="Symbol" w:hint="default"/>
+        <w:sz w:val="20"/>
+      </w:rPr>
+    </w:lvl>
+    <w:lvl w:ilvl="4" w:tentative="1">
+      <w:start w:val="1"/>
+      <w:numFmt w:val="bullet"/>
+      <w:lvlText w:val=""/>
+      <w:lvlJc w:val="left"/>
+      <w:pPr>
+        <w:tabs>
+          <w:tab w:val="num" w:pos="3600"/>
+        </w:tabs>
+        <w:ind w:left="3600" w:hanging="360"/>
+      </w:pPr>
+      <w:rPr>
+        <w:rFonts w:ascii="Symbol" w:hAnsi="Symbol" w:hint="default"/>
+        <w:sz w:val="20"/>
+      </w:rPr>
+    </w:lvl>
+    <w:lvl w:ilvl="5" w:tentative="1">
+      <w:start w:val="1"/>
+      <w:numFmt w:val="bullet"/>
+      <w:lvlText w:val=""/>
+      <w:lvlJc w:val="left"/>
+      <w:pPr>
+        <w:tabs>
+          <w:tab w:val="num" w:pos="4320"/>
+        </w:tabs>
+        <w:ind w:left="4320" w:hanging="360"/>
+      </w:pPr>
+      <w:rPr>
+        <w:rFonts w:ascii="Symbol" w:hAnsi="Symbol" w:hint="default"/>
+        <w:sz w:val="20"/>
+      </w:rPr>
+    </w:lvl>
+    <w:lvl w:ilvl="6" w:tentative="1">
+      <w:start w:val="1"/>
+      <w:numFmt w:val="bullet"/>
+      <w:lvlText w:val=""/>
+      <w:lvlJc w:val="left"/>
+      <w:pPr>
+        <w:tabs>
+          <w:tab w:val="num" w:pos="5040"/>
+        </w:tabs>
+        <w:ind w:left="5040" w:hanging="360"/>
+      </w:pPr>
+      <w:rPr>
+        <w:rFonts w:ascii="Symbol" w:hAnsi="Symbol" w:hint="default"/>
+        <w:sz w:val="20"/>
+      </w:rPr>
+    </w:lvl>
+    <w:lvl w:ilvl="7" w:tentative="1">
+      <w:start w:val="1"/>
+      <w:numFmt w:val="bullet"/>
+      <w:lvlText w:val=""/>
+      <w:lvlJc w:val="left"/>
+      <w:pPr>
+        <w:tabs>
+          <w:tab w:val="num" w:pos="5760"/>
+        </w:tabs>
+        <w:ind w:left="5760" w:hanging="360"/>
+      </w:pPr>
+      <w:rPr>
+        <w:rFonts w:ascii="Symbol" w:hAnsi="Symbol" w:hint="default"/>
+        <w:sz w:val="20"/>
+      </w:rPr>
+    </w:lvl>
+    <w:lvl w:ilvl="8" w:tentative="1">
+      <w:start w:val="1"/>
+      <w:numFmt w:val="bullet"/>
+      <w:lvlText w:val=""/>
+      <w:lvlJc w:val="left"/>
+      <w:pPr>
+        <w:tabs>
+          <w:tab w:val="num" w:pos="6480"/>
+        </w:tabs>
+        <w:ind w:left="6480" w:hanging="360"/>
+      </w:pPr>
+      <w:rPr>
+        <w:rFonts w:ascii="Symbol" w:hAnsi="Symbol" w:hint="default"/>
+        <w:sz w:val="20"/>
+      </w:rPr>
+    </w:lvl>
+  </w:abstractNum>
+  <w:abstractNum w:abstractNumId="7" w15:restartNumberingAfterBreak="0">
     <w:nsid w:val="73F37DF6"/>
     <w:multiLevelType w:val="hybridMultilevel"/>
     <w:tmpl w:val="1FF431C8"/>
@@ -891,7 +2087,7 @@
       </w:rPr>
     </w:lvl>
   </w:abstractNum>
-  <w:abstractNum w:abstractNumId="4" w15:restartNumberingAfterBreak="0">
+  <w:abstractNum w:abstractNumId="8" w15:restartNumberingAfterBreak="0">
     <w:nsid w:val="74CA32C9"/>
     <w:multiLevelType w:val="hybridMultilevel"/>
     <w:tmpl w:val="25E412A8"/>
@@ -1005,18 +2201,30 @@
     </w:lvl>
   </w:abstractNum>
   <w:num w:numId="1" w16cid:durableId="1277717240">
+    <w:abstractNumId w:val="7"/>
+  </w:num>
+  <w:num w:numId="2" w16cid:durableId="1291090197">
+    <w:abstractNumId w:val="8"/>
+  </w:num>
+  <w:num w:numId="3" w16cid:durableId="640961941">
+    <w:abstractNumId w:val="2"/>
+  </w:num>
+  <w:num w:numId="4" w16cid:durableId="554317870">
     <w:abstractNumId w:val="3"/>
   </w:num>
-  <w:num w:numId="2" w16cid:durableId="1291090197">
+  <w:num w:numId="5" w16cid:durableId="1378047375">
+    <w:abstractNumId w:val="1"/>
+  </w:num>
+  <w:num w:numId="6" w16cid:durableId="306861244">
+    <w:abstractNumId w:val="5"/>
+  </w:num>
+  <w:num w:numId="7" w16cid:durableId="912814083">
+    <w:abstractNumId w:val="6"/>
+  </w:num>
+  <w:num w:numId="8" w16cid:durableId="2113239066">
     <w:abstractNumId w:val="4"/>
   </w:num>
-  <w:num w:numId="3" w16cid:durableId="640961941">
-    <w:abstractNumId w:val="1"/>
-  </w:num>
-  <w:num w:numId="4" w16cid:durableId="554317870">
-    <w:abstractNumId w:val="2"/>
-  </w:num>
-  <w:num w:numId="5" w16cid:durableId="1378047375">
+  <w:num w:numId="9" w16cid:durableId="153184238">
     <w:abstractNumId w:val="0"/>
   </w:num>
 </w:numbering>
@@ -2238,26 +3446,6 @@
 </file>
 
 <file path=customXml/item1.xml><?xml version="1.0" encoding="utf-8"?>
-<?mso-contentType ?>
-<FormTemplates xmlns="http://schemas.microsoft.com/sharepoint/v3/contenttype/forms">
-  <Display>DocumentLibraryForm</Display>
-  <Edit>DocumentLibraryForm</Edit>
-  <New>DocumentLibraryForm</New>
-</FormTemplates>
-</file>
-
-<file path=customXml/item2.xml><?xml version="1.0" encoding="utf-8"?>
-<p:properties xmlns:p="http://schemas.microsoft.com/office/2006/metadata/properties" xmlns:xsi="http://www.w3.org/2001/XMLSchema-instance" xmlns:pc="http://schemas.microsoft.com/office/infopath/2007/PartnerControls">
-  <documentManagement>
-    <TaxCatchAll xmlns="a821ace4-ee73-4986-87d0-84fdf44069cc" xsi:nil="true"/>
-    <lcf76f155ced4ddcb4097134ff3c332f xmlns="f52f1208-f7be-41fd-a7b4-eaf230f21e9d">
-      <Terms xmlns="http://schemas.microsoft.com/office/infopath/2007/PartnerControls"/>
-    </lcf76f155ced4ddcb4097134ff3c332f>
-  </documentManagement>
-</p:properties>
-</file>
-
-<file path=customXml/item3.xml><?xml version="1.0" encoding="utf-8"?>
 <ct:contentTypeSchema xmlns:ct="http://schemas.microsoft.com/office/2006/metadata/contentType" xmlns:ma="http://schemas.microsoft.com/office/2006/metadata/properties/metaAttributes" ct:_="" ma:_="" ma:contentTypeName="Document" ma:contentTypeID="0x0101002D5CD59641876D4181C523FF443CFA32" ma:contentTypeVersion="18" ma:contentTypeDescription="Create a new document." ma:contentTypeScope="" ma:versionID="9b8dcd280b59fb31f9707c119493fa4d">
   <xsd:schema xmlns:xsd="http://www.w3.org/2001/XMLSchema" xmlns:xs="http://www.w3.org/2001/XMLSchema" xmlns:p="http://schemas.microsoft.com/office/2006/metadata/properties" xmlns:ns2="f52f1208-f7be-41fd-a7b4-eaf230f21e9d" xmlns:ns3="a821ace4-ee73-4986-87d0-84fdf44069cc" targetNamespace="http://schemas.microsoft.com/office/2006/metadata/properties" ma:root="true" ma:fieldsID="3c014d5325aa0db202d1c2144d85afeb" ns2:_="" ns3:_="">
     <xsd:import namespace="f52f1208-f7be-41fd-a7b4-eaf230f21e9d"/>
@@ -2512,26 +3700,27 @@
 </ct:contentTypeSchema>
 </file>
 
-<file path=customXml/itemProps1.xml><?xml version="1.0" encoding="utf-8"?>
-<ds:datastoreItem xmlns:ds="http://schemas.openxmlformats.org/officeDocument/2006/customXml" ds:itemID="{12C1B7E9-12DF-4E7C-8403-8B879E2203C1}">
-  <ds:schemaRefs>
-    <ds:schemaRef ds:uri="http://schemas.microsoft.com/sharepoint/v3/contenttype/forms"/>
-  </ds:schemaRefs>
-</ds:datastoreItem>
+<file path=customXml/item2.xml><?xml version="1.0" encoding="utf-8"?>
+<?mso-contentType ?>
+<FormTemplates xmlns="http://schemas.microsoft.com/sharepoint/v3/contenttype/forms">
+  <Display>DocumentLibraryForm</Display>
+  <Edit>DocumentLibraryForm</Edit>
+  <New>DocumentLibraryForm</New>
+</FormTemplates>
 </file>
 
-<file path=customXml/itemProps2.xml><?xml version="1.0" encoding="utf-8"?>
-<ds:datastoreItem xmlns:ds="http://schemas.openxmlformats.org/officeDocument/2006/customXml" ds:itemID="{C82F892E-C1D1-4F1E-B5A0-D98F6AD12FA4}">
-  <ds:schemaRefs>
-    <ds:schemaRef ds:uri="http://schemas.microsoft.com/office/2006/metadata/properties"/>
-    <ds:schemaRef ds:uri="http://schemas.microsoft.com/office/infopath/2007/PartnerControls"/>
-    <ds:schemaRef ds:uri="a821ace4-ee73-4986-87d0-84fdf44069cc"/>
-    <ds:schemaRef ds:uri="f52f1208-f7be-41fd-a7b4-eaf230f21e9d"/>
-  </ds:schemaRefs>
-</ds:datastoreItem>
+<file path=customXml/item3.xml><?xml version="1.0" encoding="utf-8"?>
+<p:properties xmlns:p="http://schemas.microsoft.com/office/2006/metadata/properties" xmlns:xsi="http://www.w3.org/2001/XMLSchema-instance" xmlns:pc="http://schemas.microsoft.com/office/infopath/2007/PartnerControls">
+  <documentManagement>
+    <TaxCatchAll xmlns="a821ace4-ee73-4986-87d0-84fdf44069cc" xsi:nil="true"/>
+    <lcf76f155ced4ddcb4097134ff3c332f xmlns="f52f1208-f7be-41fd-a7b4-eaf230f21e9d">
+      <Terms xmlns="http://schemas.microsoft.com/office/infopath/2007/PartnerControls"/>
+    </lcf76f155ced4ddcb4097134ff3c332f>
+  </documentManagement>
+</p:properties>
 </file>
 
-<file path=customXml/itemProps3.xml><?xml version="1.0" encoding="utf-8"?>
+<file path=customXml/itemProps1.xml><?xml version="1.0" encoding="utf-8"?>
 <ds:datastoreItem xmlns:ds="http://schemas.openxmlformats.org/officeDocument/2006/customXml" ds:itemID="{14A3BD85-0A76-40A5-8BB0-12E6D026C5ED}">
   <ds:schemaRefs>
     <ds:schemaRef ds:uri="http://schemas.microsoft.com/office/2006/metadata/contentType"/>
@@ -2548,4 +3737,23 @@
     <ds:schemaRef ds:uri="http://schemas.microsoft.com/internal/obd"/>
   </ds:schemaRefs>
 </ds:datastoreItem>
+</file>
+
+<file path=customXml/itemProps2.xml><?xml version="1.0" encoding="utf-8"?>
+<ds:datastoreItem xmlns:ds="http://schemas.openxmlformats.org/officeDocument/2006/customXml" ds:itemID="{12C1B7E9-12DF-4E7C-8403-8B879E2203C1}">
+  <ds:schemaRefs>
+    <ds:schemaRef ds:uri="http://schemas.microsoft.com/sharepoint/v3/contenttype/forms"/>
+  </ds:schemaRefs>
+</ds:datastoreItem>
+</file>
+
+<file path=customXml/itemProps3.xml><?xml version="1.0" encoding="utf-8"?>
+<ds:datastoreItem xmlns:ds="http://schemas.openxmlformats.org/officeDocument/2006/customXml" ds:itemID="{C82F892E-C1D1-4F1E-B5A0-D98F6AD12FA4}">
+  <ds:schemaRefs>
+    <ds:schemaRef ds:uri="http://schemas.microsoft.com/office/2006/metadata/properties"/>
+    <ds:schemaRef ds:uri="http://schemas.microsoft.com/office/infopath/2007/PartnerControls"/>
+    <ds:schemaRef ds:uri="a821ace4-ee73-4986-87d0-84fdf44069cc"/>
+    <ds:schemaRef ds:uri="f52f1208-f7be-41fd-a7b4-eaf230f21e9d"/>
+  </ds:schemaRefs>
+</ds:datastoreItem>
 </file>
</xml_diff>